<commit_message>
updated for july 2022
</commit_message>
<xml_diff>
--- a/Labs/lab_ch_10.docx
+++ b/Labs/lab_ch_10.docx
@@ -363,25 +363,25 @@
         <w:t xml:space="preserve"> </w:t>
       </w:r>
       <w:r>
-        <w:t xml:space="preserve">find the minimum detectable effect for a randomized block study with</w:t>
-      </w:r>
-      <w:r>
-        <w:t xml:space="preserve"> </w:t>
-      </w:r>
-      <w:r>
-        <w:t xml:space="preserve">random effects that employed 5 schools, in each of which are 2 teachers</w:t>
-      </w:r>
-      <w:r>
-        <w:t xml:space="preserve"> </w:t>
-      </w:r>
-      <w:r>
-        <w:t xml:space="preserve">randomized into treatment and 2 randomized into control, each with 20</w:t>
-      </w:r>
-      <w:r>
-        <w:t xml:space="preserve"> </w:t>
-      </w:r>
-      <w:r>
-        <w:t xml:space="preserve">students, when power is .8 for a test with a significance level of .05.</w:t>
+        <w:t xml:space="preserve">find the minimum detectable effect for a randomized block study that</w:t>
+      </w:r>
+      <w:r>
+        <w:t xml:space="preserve"> </w:t>
+      </w:r>
+      <w:r>
+        <w:t xml:space="preserve">employed 5 schools, in each of which are 2 teachers randomized into</w:t>
+      </w:r>
+      <w:r>
+        <w:t xml:space="preserve"> </w:t>
+      </w:r>
+      <w:r>
+        <w:t xml:space="preserve">treatment and 2 randomized into control, each with 20 students, when</w:t>
+      </w:r>
+      <w:r>
+        <w:t xml:space="preserve"> </w:t>
+      </w:r>
+      <w:r>
+        <w:t xml:space="preserve">power is .8 for a test with a significance level of .05.</w:t>
       </w:r>
     </w:p>
     <w:bookmarkEnd w:id="23"/>
@@ -437,25 +437,25 @@
         <w:t xml:space="preserve"> </w:t>
       </w:r>
       <w:r>
-        <w:t xml:space="preserve">detectable effect for a randomized block study with random effects that</w:t>
-      </w:r>
-      <w:r>
-        <w:t xml:space="preserve"> </w:t>
-      </w:r>
-      <w:r>
-        <w:t xml:space="preserve">employed 5 schools, in each of which there is 1 teacher randomized into</w:t>
-      </w:r>
-      <w:r>
-        <w:t xml:space="preserve"> </w:t>
-      </w:r>
-      <w:r>
-        <w:t xml:space="preserve">treatment and 1 randomized into control, each with 20 students, when</w:t>
-      </w:r>
-      <w:r>
-        <w:t xml:space="preserve"> </w:t>
-      </w:r>
-      <w:r>
-        <w:t xml:space="preserve">power is .8 for a test with a significance level of .05.</w:t>
+        <w:t xml:space="preserve">detectable effect for a randomized block study that employed 5 schools,</w:t>
+      </w:r>
+      <w:r>
+        <w:t xml:space="preserve"> </w:t>
+      </w:r>
+      <w:r>
+        <w:t xml:space="preserve">in each of which there is 1 teacher randomized into treatment and 1</w:t>
+      </w:r>
+      <w:r>
+        <w:t xml:space="preserve"> </w:t>
+      </w:r>
+      <w:r>
+        <w:t xml:space="preserve">randomized into control, each with 20 students, when power is .8 for a</w:t>
+      </w:r>
+      <w:r>
+        <w:t xml:space="preserve"> </w:t>
+      </w:r>
+      <w:r>
+        <w:t xml:space="preserve">test with a significance level of .05.</w:t>
       </w:r>
     </w:p>
     <w:bookmarkEnd w:id="24"/>
@@ -727,7 +727,7 @@
     <w:bookmarkEnd w:id="26"/>
     <w:bookmarkEnd w:id="27"/>
     <w:bookmarkEnd w:id="28"/>
-    <w:bookmarkStart w:id="31" w:name="references"/>
+    <w:bookmarkStart w:id="30" w:name="references"/>
     <w:p>
       <w:pPr>
         <w:pStyle w:val="Heading1"/>
@@ -817,100 +817,7 @@
         </w:r>
       </w:hyperlink>
     </w:p>
-    <w:p>
-      <w:pPr>
-        <w:pStyle w:val="BodyText"/>
-      </w:pPr>
-      <w:hyperlink r:id="rId30">
-        <w:r>
-          <w:rPr>
-            <w:rStyle w:val="Hyperlink"/>
-          </w:rPr>
-          <w:t xml:space="preserve">Spybrook, J., Westine, C. D., &amp; Taylor, J. A. (2016). Design parameters</w:t>
-        </w:r>
-        <w:r>
-          <w:rPr>
-            <w:rStyle w:val="Hyperlink"/>
-          </w:rPr>
-          <w:t xml:space="preserve"> </w:t>
-        </w:r>
-        <w:r>
-          <w:rPr>
-            <w:rStyle w:val="Hyperlink"/>
-          </w:rPr>
-          <w:t xml:space="preserve">for impact research in science education: A multistate analysis.</w:t>
-        </w:r>
-        <w:r>
-          <w:rPr>
-            <w:rStyle w:val="Hyperlink"/>
-          </w:rPr>
-          <w:t xml:space="preserve"> </w:t>
-        </w:r>
-        <w:r>
-          <w:rPr>
-            <w:rStyle w:val="Hyperlink"/>
-            <w:iCs/>
-            <w:i/>
-          </w:rPr>
-          <w:t xml:space="preserve">AERA</w:t>
-        </w:r>
-        <w:r>
-          <w:rPr>
-            <w:rStyle w:val="Hyperlink"/>
-            <w:iCs/>
-            <w:i/>
-          </w:rPr>
-          <w:t xml:space="preserve"> </w:t>
-        </w:r>
-        <w:r>
-          <w:rPr>
-            <w:rStyle w:val="Hyperlink"/>
-            <w:iCs/>
-            <w:i/>
-          </w:rPr>
-          <w:t xml:space="preserve">Open</w:t>
-        </w:r>
-        <w:r>
-          <w:rPr>
-            <w:rStyle w:val="Hyperlink"/>
-          </w:rPr>
-          <w:t xml:space="preserve">,</w:t>
-        </w:r>
-        <w:r>
-          <w:rPr>
-            <w:rStyle w:val="Hyperlink"/>
-          </w:rPr>
-          <w:t xml:space="preserve"> </w:t>
-        </w:r>
-        <w:r>
-          <w:rPr>
-            <w:rStyle w:val="Hyperlink"/>
-            <w:iCs/>
-            <w:i/>
-          </w:rPr>
-          <w:t xml:space="preserve">2</w:t>
-        </w:r>
-        <w:r>
-          <w:rPr>
-            <w:rStyle w:val="Hyperlink"/>
-          </w:rPr>
-          <w:t xml:space="preserve">(1),</w:t>
-        </w:r>
-        <w:r>
-          <w:rPr>
-            <w:rStyle w:val="Hyperlink"/>
-          </w:rPr>
-          <w:t xml:space="preserve"> </w:t>
-        </w:r>
-        <w:r>
-          <w:rPr>
-            <w:rStyle w:val="Hyperlink"/>
-          </w:rPr>
-          <w:t xml:space="preserve">2332858415625975.</w:t>
-        </w:r>
-      </w:hyperlink>
-    </w:p>
-    <w:bookmarkEnd w:id="31"/>
+    <w:bookmarkEnd w:id="30"/>
     <w:sectPr/>
   </w:body>
 </w:document>
@@ -942,7 +849,7 @@
 <file path=word/numbering.xml><?xml version="1.0" encoding="utf-8"?>
 <w:numbering xmlns:w="http://schemas.openxmlformats.org/wordprocessingml/2006/main">
   <w:abstractNum w:abstractNumId="990">
-    <w:nsid w:val="2c1ae401"/>
+    <w:nsid w:val="A990"/>
     <w:multiLevelType w:val="multilevel"/>
     <w:lvl w:ilvl="0">
       <w:numFmt w:val="bullet"/>
@@ -1028,10 +935,10 @@
   <w:docDefaults>
     <w:rPrDefault>
       <w:rPr>
-        <w:rFonts w:asciiTheme="minorHAnsi" w:eastAsiaTheme="minorHAnsi" w:hAnsiTheme="minorHAnsi" w:cstheme="minorBidi"/>
+        <w:rFonts w:asciiTheme="minorHAnsi" w:cstheme="minorBidi" w:eastAsiaTheme="minorHAnsi" w:hAnsiTheme="minorHAnsi"/>
         <w:sz w:val="24"/>
         <w:szCs w:val="24"/>
-        <w:lang w:val="en-US" w:eastAsia="en-US" w:bidi="ar-SA"/>
+        <w:lang w:bidi="ar-SA" w:eastAsia="en-US" w:val="en-US"/>
       </w:rPr>
     </w:rPrDefault>
     <w:pPrDefault>
@@ -1040,35 +947,35 @@
       </w:pPr>
     </w:pPrDefault>
   </w:docDefaults>
-  <w:latentStyles w:defLockedState="0" w:defUIPriority="0" w:defSemiHidden="0" w:defUnhideWhenUsed="0" w:defQFormat="0" w:count="276"/>
-  <w:style w:type="paragraph" w:default="1" w:styleId="Normal">
+  <w:latentStyles w:count="276" w:defLockedState="0" w:defQFormat="0" w:defSemiHidden="0" w:defUIPriority="0" w:defUnhideWhenUsed="0"/>
+  <w:style w:default="1" w:styleId="Normal" w:type="paragraph">
     <w:name w:val="Normal"/>
     <w:qFormat/>
   </w:style>
-  <w:style w:type="paragraph" w:styleId="BodyText">
+  <w:style w:styleId="BodyText" w:type="paragraph">
     <w:name w:val="Body Text"/>
     <w:basedOn w:val="Normal"/>
     <w:link w:val="BodyTextChar"/>
     <w:pPr>
-      <w:spacing w:before="180" w:after="180"/>
-    </w:pPr>
-    <w:qFormat/>
-  </w:style>
-  <w:style w:type="paragraph" w:customStyle="1" w:styleId="FirstParagraph">
+      <w:spacing w:after="180" w:before="180"/>
+    </w:pPr>
+    <w:qFormat/>
+  </w:style>
+  <w:style w:customStyle="1" w:styleId="FirstParagraph" w:type="paragraph">
     <w:name w:val="First Paragraph"/>
     <w:basedOn w:val="BodyText"/>
     <w:next w:val="BodyText"/>
     <w:qFormat/>
   </w:style>
-  <w:style w:type="paragraph" w:customStyle="1" w:styleId="Compact">
+  <w:style w:customStyle="1" w:styleId="Compact" w:type="paragraph">
     <w:name w:val="Compact"/>
     <w:basedOn w:val="BodyText"/>
     <w:qFormat/>
     <w:pPr>
-      <w:spacing w:before="36" w:after="36"/>
-    </w:pPr>
-  </w:style>
-  <w:style w:type="paragraph" w:styleId="Title">
+      <w:spacing w:after="36" w:before="36"/>
+    </w:pPr>
+  </w:style>
+  <w:style w:styleId="Title" w:type="paragraph">
     <w:name w:val="Title"/>
     <w:basedOn w:val="Normal"/>
     <w:next w:val="BodyText"/>
@@ -1076,19 +983,19 @@
     <w:pPr>
       <w:keepNext/>
       <w:keepLines/>
-      <w:spacing w:before="480" w:after="240"/>
+      <w:spacing w:after="240" w:before="480"/>
       <w:jc w:val="center"/>
     </w:pPr>
     <w:rPr>
-      <w:rFonts w:asciiTheme="majorHAnsi" w:eastAsiaTheme="majorEastAsia" w:hAnsiTheme="majorHAnsi" w:cstheme="majorBidi"/>
+      <w:rFonts w:asciiTheme="majorHAnsi" w:cstheme="majorBidi" w:eastAsiaTheme="majorEastAsia" w:hAnsiTheme="majorHAnsi"/>
       <w:b/>
       <w:bCs/>
-      <w:color w:val="345A8A" w:themeColor="accent1" w:themeShade="B5"/>
+      <w:color w:themeColor="accent1" w:themeShade="B5" w:val="345A8A"/>
       <w:sz w:val="36"/>
       <w:szCs w:val="36"/>
     </w:rPr>
   </w:style>
-  <w:style w:type="paragraph" w:styleId="Subtitle">
+  <w:style w:styleId="Subtitle" w:type="paragraph">
     <w:name w:val="Subtitle"/>
     <w:basedOn w:val="Title"/>
     <w:next w:val="BodyText"/>
@@ -1096,7 +1003,7 @@
     <w:pPr>
       <w:keepNext/>
       <w:keepLines/>
-      <w:spacing w:before="240" w:after="240"/>
+      <w:spacing w:after="240" w:before="240"/>
       <w:jc w:val="center"/>
     </w:pPr>
     <w:rPr>
@@ -1104,7 +1011,7 @@
       <w:szCs w:val="30"/>
     </w:rPr>
   </w:style>
-  <w:style w:type="paragraph" w:customStyle="1" w:styleId="Author">
+  <w:style w:customStyle="1" w:styleId="Author" w:type="paragraph">
     <w:name w:val="Author"/>
     <w:next w:val="BodyText"/>
     <w:qFormat/>
@@ -1114,7 +1021,7 @@
       <w:jc w:val="center"/>
     </w:pPr>
   </w:style>
-  <w:style w:type="paragraph" w:styleId="Date">
+  <w:style w:styleId="Date" w:type="paragraph">
     <w:name w:val="Date"/>
     <w:next w:val="BodyText"/>
     <w:qFormat/>
@@ -1124,7 +1031,7 @@
       <w:jc w:val="center"/>
     </w:pPr>
   </w:style>
-  <w:style w:type="paragraph" w:customStyle="1" w:styleId="Abstract">
+  <w:style w:customStyle="1" w:styleId="Abstract" w:type="paragraph">
     <w:name w:val="Abstract"/>
     <w:basedOn w:val="Normal"/>
     <w:next w:val="BodyText"/>
@@ -1132,14 +1039,14 @@
     <w:pPr>
       <w:keepNext/>
       <w:keepLines/>
-      <w:spacing w:before="300" w:after="300"/>
+      <w:spacing w:after="300" w:before="300"/>
     </w:pPr>
     <w:rPr>
       <w:sz w:val="20"/>
       <w:szCs w:val="20"/>
     </w:rPr>
   </w:style>
-  <w:style w:type="paragraph" w:styleId="Bibliography">
+  <w:style w:styleId="Bibliography" w:type="paragraph">
     <w:name w:val="Bibliography"/>
     <w:basedOn w:val="Normal"/>
     <w:next w:val="Bibliography"/>
@@ -1147,7 +1054,7 @@
     <w:pPr/>
     <w:rPr/>
   </w:style>
-  <w:style w:type="paragraph" w:styleId="Heading1">
+  <w:style w:styleId="Heading1" w:type="paragraph">
     <w:name w:val="Heading 1"/>
     <w:basedOn w:val="Normal"/>
     <w:next w:val="BodyText"/>
@@ -1156,19 +1063,19 @@
     <w:pPr>
       <w:keepNext/>
       <w:keepLines/>
-      <w:spacing w:before="480" w:after="0"/>
+      <w:spacing w:after="0" w:before="480"/>
       <w:outlineLvl w:val="0"/>
     </w:pPr>
     <w:rPr>
-      <w:rFonts w:asciiTheme="majorHAnsi" w:eastAsiaTheme="majorEastAsia" w:hAnsiTheme="majorHAnsi" w:cstheme="majorBidi"/>
+      <w:rFonts w:asciiTheme="majorHAnsi" w:cstheme="majorBidi" w:eastAsiaTheme="majorEastAsia" w:hAnsiTheme="majorHAnsi"/>
       <w:b/>
       <w:bCs/>
-      <w:color w:val="4F81BD" w:themeColor="accent1"/>
+      <w:color w:themeColor="accent1" w:val="4F81BD"/>
       <w:sz w:val="32"/>
       <w:szCs w:val="32"/>
     </w:rPr>
   </w:style>
-  <w:style w:type="paragraph" w:styleId="Heading2">
+  <w:style w:styleId="Heading2" w:type="paragraph">
     <w:name w:val="Heading 2"/>
     <w:basedOn w:val="Normal"/>
     <w:next w:val="BodyText"/>
@@ -1178,19 +1085,19 @@
     <w:pPr>
       <w:keepNext/>
       <w:keepLines/>
-      <w:spacing w:before="200" w:after="0"/>
+      <w:spacing w:after="0" w:before="200"/>
       <w:outlineLvl w:val="1"/>
     </w:pPr>
     <w:rPr>
-      <w:rFonts w:asciiTheme="majorHAnsi" w:eastAsiaTheme="majorEastAsia" w:hAnsiTheme="majorHAnsi" w:cstheme="majorBidi"/>
+      <w:rFonts w:asciiTheme="majorHAnsi" w:cstheme="majorBidi" w:eastAsiaTheme="majorEastAsia" w:hAnsiTheme="majorHAnsi"/>
       <w:b/>
       <w:bCs/>
-      <w:color w:val="4F81BD" w:themeColor="accent1"/>
+      <w:color w:themeColor="accent1" w:val="4F81BD"/>
       <w:sz w:val="28"/>
       <w:szCs w:val="28"/>
     </w:rPr>
   </w:style>
-  <w:style w:type="paragraph" w:styleId="Heading3">
+  <w:style w:styleId="Heading3" w:type="paragraph">
     <w:name w:val="Heading 3"/>
     <w:basedOn w:val="Normal"/>
     <w:next w:val="BodyText"/>
@@ -1200,19 +1107,19 @@
     <w:pPr>
       <w:keepNext/>
       <w:keepLines/>
-      <w:spacing w:before="200" w:after="0"/>
+      <w:spacing w:after="0" w:before="200"/>
       <w:outlineLvl w:val="2"/>
     </w:pPr>
     <w:rPr>
-      <w:rFonts w:asciiTheme="majorHAnsi" w:eastAsiaTheme="majorEastAsia" w:hAnsiTheme="majorHAnsi" w:cstheme="majorBidi"/>
+      <w:rFonts w:asciiTheme="majorHAnsi" w:cstheme="majorBidi" w:eastAsiaTheme="majorEastAsia" w:hAnsiTheme="majorHAnsi"/>
       <w:b/>
       <w:bCs/>
-      <w:color w:val="4F81BD" w:themeColor="accent1"/>
+      <w:color w:themeColor="accent1" w:val="4F81BD"/>
       <w:sz w:val="24"/>
       <w:szCs w:val="24"/>
     </w:rPr>
   </w:style>
-  <w:style w:type="paragraph" w:styleId="Heading4">
+  <w:style w:styleId="Heading4" w:type="paragraph">
     <w:name w:val="Heading 4"/>
     <w:basedOn w:val="Normal"/>
     <w:next w:val="BodyText"/>
@@ -1222,19 +1129,19 @@
     <w:pPr>
       <w:keepNext/>
       <w:keepLines/>
-      <w:spacing w:before="200" w:after="0"/>
+      <w:spacing w:after="0" w:before="200"/>
       <w:outlineLvl w:val="3"/>
     </w:pPr>
     <w:rPr>
-      <w:rFonts w:asciiTheme="majorHAnsi" w:eastAsiaTheme="majorEastAsia" w:hAnsiTheme="majorHAnsi" w:cstheme="majorBidi"/>
+      <w:rFonts w:asciiTheme="majorHAnsi" w:cstheme="majorBidi" w:eastAsiaTheme="majorEastAsia" w:hAnsiTheme="majorHAnsi"/>
       <w:i/>
       <w:bCs/>
-      <w:color w:val="4F81BD" w:themeColor="accent1"/>
+      <w:color w:themeColor="accent1" w:val="4F81BD"/>
       <w:sz w:val="24"/>
       <w:szCs w:val="24"/>
     </w:rPr>
   </w:style>
-  <w:style w:type="paragraph" w:styleId="Heading5">
+  <w:style w:styleId="Heading5" w:type="paragraph">
     <w:name w:val="Heading 5"/>
     <w:basedOn w:val="Normal"/>
     <w:next w:val="BodyText"/>
@@ -1244,18 +1151,18 @@
     <w:pPr>
       <w:keepNext/>
       <w:keepLines/>
-      <w:spacing w:before="200" w:after="0"/>
+      <w:spacing w:after="0" w:before="200"/>
       <w:outlineLvl w:val="4"/>
     </w:pPr>
     <w:rPr>
-      <w:rFonts w:asciiTheme="majorHAnsi" w:eastAsiaTheme="majorEastAsia" w:hAnsiTheme="majorHAnsi" w:cstheme="majorBidi"/>
+      <w:rFonts w:asciiTheme="majorHAnsi" w:cstheme="majorBidi" w:eastAsiaTheme="majorEastAsia" w:hAnsiTheme="majorHAnsi"/>
       <w:iCs/>
-      <w:color w:val="4F81BD" w:themeColor="accent1"/>
+      <w:color w:themeColor="accent1" w:val="4F81BD"/>
       <w:sz w:val="24"/>
       <w:szCs w:val="24"/>
     </w:rPr>
   </w:style>
-  <w:style w:type="paragraph" w:styleId="Heading6">
+  <w:style w:styleId="Heading6" w:type="paragraph">
     <w:name w:val="Heading 6"/>
     <w:basedOn w:val="Normal"/>
     <w:next w:val="BodyText"/>
@@ -1265,17 +1172,17 @@
     <w:pPr>
       <w:keepNext/>
       <w:keepLines/>
-      <w:spacing w:before="200" w:after="0"/>
+      <w:spacing w:after="0" w:before="200"/>
       <w:outlineLvl w:val="5"/>
     </w:pPr>
     <w:rPr>
-      <w:rFonts w:asciiTheme="majorHAnsi" w:eastAsiaTheme="majorEastAsia" w:hAnsiTheme="majorHAnsi" w:cstheme="majorBidi"/>
-      <w:color w:val="4F81BD" w:themeColor="accent1"/>
+      <w:rFonts w:asciiTheme="majorHAnsi" w:cstheme="majorBidi" w:eastAsiaTheme="majorEastAsia" w:hAnsiTheme="majorHAnsi"/>
+      <w:color w:themeColor="accent1" w:val="4F81BD"/>
       <w:sz w:val="24"/>
       <w:szCs w:val="24"/>
     </w:rPr>
   </w:style>
-  <w:style w:type="paragraph" w:styleId="Heading7">
+  <w:style w:styleId="Heading7" w:type="paragraph">
     <w:name w:val="Heading 7"/>
     <w:basedOn w:val="Normal"/>
     <w:next w:val="BodyText"/>
@@ -1285,17 +1192,17 @@
     <w:pPr>
       <w:keepNext/>
       <w:keepLines/>
-      <w:spacing w:before="200" w:after="0"/>
+      <w:spacing w:after="0" w:before="200"/>
       <w:outlineLvl w:val="6"/>
     </w:pPr>
     <w:rPr>
-      <w:rFonts w:asciiTheme="majorHAnsi" w:eastAsiaTheme="majorEastAsia" w:hAnsiTheme="majorHAnsi" w:cstheme="majorBidi"/>
-      <w:color w:val="4F81BD" w:themeColor="accent1"/>
+      <w:rFonts w:asciiTheme="majorHAnsi" w:cstheme="majorBidi" w:eastAsiaTheme="majorEastAsia" w:hAnsiTheme="majorHAnsi"/>
+      <w:color w:themeColor="accent1" w:val="4F81BD"/>
       <w:sz w:val="24"/>
       <w:szCs w:val="24"/>
     </w:rPr>
   </w:style>
-  <w:style w:type="paragraph" w:styleId="Heading8">
+  <w:style w:styleId="Heading8" w:type="paragraph">
     <w:name w:val="Heading 8"/>
     <w:basedOn w:val="Normal"/>
     <w:next w:val="BodyText"/>
@@ -1305,17 +1212,17 @@
     <w:pPr>
       <w:keepNext/>
       <w:keepLines/>
-      <w:spacing w:before="200" w:after="0"/>
+      <w:spacing w:after="0" w:before="200"/>
       <w:outlineLvl w:val="7"/>
     </w:pPr>
     <w:rPr>
-      <w:rFonts w:asciiTheme="majorHAnsi" w:eastAsiaTheme="majorEastAsia" w:hAnsiTheme="majorHAnsi" w:cstheme="majorBidi"/>
-      <w:color w:val="4F81BD" w:themeColor="accent1"/>
+      <w:rFonts w:asciiTheme="majorHAnsi" w:cstheme="majorBidi" w:eastAsiaTheme="majorEastAsia" w:hAnsiTheme="majorHAnsi"/>
+      <w:color w:themeColor="accent1" w:val="4F81BD"/>
       <w:sz w:val="24"/>
       <w:szCs w:val="24"/>
     </w:rPr>
   </w:style>
-  <w:style w:type="paragraph" w:styleId="Heading9">
+  <w:style w:styleId="Heading9" w:type="paragraph">
     <w:name w:val="Heading 9"/>
     <w:basedOn w:val="Normal"/>
     <w:next w:val="BodyText"/>
@@ -1325,17 +1232,17 @@
     <w:pPr>
       <w:keepNext/>
       <w:keepLines/>
-      <w:spacing w:before="200" w:after="0"/>
+      <w:spacing w:after="0" w:before="200"/>
       <w:outlineLvl w:val="8"/>
     </w:pPr>
     <w:rPr>
-      <w:rFonts w:asciiTheme="majorHAnsi" w:eastAsiaTheme="majorEastAsia" w:hAnsiTheme="majorHAnsi" w:cstheme="majorBidi"/>
-      <w:color w:val="4F81BD" w:themeColor="accent1"/>
+      <w:rFonts w:asciiTheme="majorHAnsi" w:cstheme="majorBidi" w:eastAsiaTheme="majorEastAsia" w:hAnsiTheme="majorHAnsi"/>
+      <w:color w:themeColor="accent1" w:val="4F81BD"/>
       <w:sz w:val="24"/>
       <w:szCs w:val="24"/>
     </w:rPr>
   </w:style>
-  <w:style w:type="paragraph" w:styleId="BlockText">
+  <w:style w:styleId="BlockText" w:type="paragraph">
     <w:name w:val="Block Text"/>
     <w:basedOn w:val="BodyText"/>
     <w:next w:val="BodyText"/>
@@ -1343,11 +1250,11 @@
     <w:unhideWhenUsed/>
     <w:qFormat/>
     <w:pPr>
-      <w:spacing w:before="100" w:after="100"/>
+      <w:spacing w:after="100" w:before="100"/>
       <w:ind w:firstLine="0" w:left="480" w:right="480"/>
     </w:pPr>
   </w:style>
-  <w:style w:type="paragraph" w:styleId="FootnoteText">
+  <w:style w:styleId="FootnoteText" w:type="paragraph">
     <w:name w:val="Footnote Text"/>
     <w:basedOn w:val="Normal"/>
     <w:next w:val="FootnoteText"/>
@@ -1355,30 +1262,30 @@
     <w:unhideWhenUsed/>
     <w:qFormat/>
   </w:style>
-  <w:style w:type="character" w:default="1" w:styleId="DefaultParagraphFont">
+  <w:style w:default="1" w:styleId="DefaultParagraphFont" w:type="character">
     <w:name w:val="Default Paragraph Font"/>
     <w:semiHidden/>
     <w:unhideWhenUsed/>
   </w:style>
-  <w:style w:type="table" w:default="1" w:styleId="Table">
+  <w:style w:default="1" w:styleId="Table" w:type="table">
     <w:name w:val="Table"/>
     <w:basedOn w:val="TableNormal"/>
     <w:semiHidden/>
     <w:unhideWhenUsed/>
     <w:qFormat/>
     <w:tblPr>
-      <w:tblInd w:w="0" w:type="dxa"/>
+      <w:tblInd w:type="dxa" w:w="0"/>
       <w:tblCellMar>
-        <w:top w:w="0" w:type="dxa"/>
-        <w:left w:w="108" w:type="dxa"/>
-        <w:bottom w:w="0" w:type="dxa"/>
-        <w:right w:w="108" w:type="dxa"/>
+        <w:top w:type="dxa" w:w="0"/>
+        <w:left w:type="dxa" w:w="108"/>
+        <w:bottom w:type="dxa" w:w="0"/>
+        <w:right w:type="dxa" w:w="108"/>
       </w:tblCellMar>
     </w:tblPr>
     <w:tblStylePr w:type="firstRow">
       <w:tblPr>
         <w:jc w:val="left"/>
-        <w:tblInd w:w="0" w:type="dxa"/>
+        <w:tblInd w:type="dxa" w:w="0"/>
       </w:tblPr>
       <w:trPr>
         <w:jc w:val="left"/>
@@ -1391,7 +1298,7 @@
       </w:tcPr>
     </w:tblStylePr>
   </w:style>
-  <w:style w:type="paragraph" w:customStyle="1" w:styleId="DefinitionTerm">
+  <w:style w:customStyle="1" w:styleId="DefinitionTerm" w:type="paragraph">
     <w:name w:val="Definition Term"/>
     <w:basedOn w:val="Normal"/>
     <w:next w:val="Definition"/>
@@ -1404,49 +1311,49 @@
       <w:b/>
     </w:rPr>
   </w:style>
-  <w:style w:type="paragraph" w:customStyle="1" w:styleId="Definition">
+  <w:style w:customStyle="1" w:styleId="Definition" w:type="paragraph">
     <w:name w:val="Definition"/>
     <w:basedOn w:val="Normal"/>
   </w:style>
-  <w:style w:type="paragraph" w:styleId="Caption">
+  <w:style w:styleId="Caption" w:type="paragraph">
     <w:name w:val="Caption"/>
     <w:basedOn w:val="Normal"/>
     <w:link w:val="BodyTextChar"/>
     <w:pPr>
-      <w:spacing w:before="0" w:after="120"/>
+      <w:spacing w:after="120" w:before="0"/>
     </w:pPr>
     <w:rPr>
       <w:i/>
     </w:rPr>
   </w:style>
-  <w:style w:type="paragraph" w:customStyle="1" w:styleId="TableCaption">
+  <w:style w:customStyle="1" w:styleId="TableCaption" w:type="paragraph">
     <w:name w:val="Table Caption"/>
     <w:basedOn w:val="Caption"/>
     <w:pPr>
       <w:keepNext/>
     </w:pPr>
   </w:style>
-  <w:style w:type="paragraph" w:customStyle="1" w:styleId="ImageCaption">
+  <w:style w:customStyle="1" w:styleId="ImageCaption" w:type="paragraph">
     <w:name w:val="Image Caption"/>
     <w:basedOn w:val="Caption"/>
   </w:style>
-  <w:style w:type="paragraph" w:customStyle="1" w:styleId="Figure">
+  <w:style w:customStyle="1" w:styleId="Figure" w:type="paragraph">
     <w:name w:val="Figure"/>
     <w:basedOn w:val="Normal"/>
   </w:style>
-  <w:style w:type="paragraph" w:customStyle="1" w:styleId="CaptionedFigure">
+  <w:style w:customStyle="1" w:styleId="CaptionedFigure" w:type="paragraph">
     <w:name w:val="Captioned Figure"/>
     <w:basedOn w:val="Figure"/>
     <w:pPr>
       <w:keepNext/>
     </w:pPr>
   </w:style>
-  <w:style w:type="character" w:customStyle="1" w:styleId="BodyTextChar">
+  <w:style w:customStyle="1" w:styleId="BodyTextChar" w:type="character">
     <w:name w:val="Body Text Char"/>
     <w:basedOn w:val="DefaultParagraphFont"/>
     <w:link w:val="BodyText"/>
   </w:style>
-  <w:style w:type="character" w:customStyle="1" w:styleId="VerbatimChar">
+  <w:style w:customStyle="1" w:styleId="VerbatimChar" w:type="character">
     <w:name w:val="Verbatim Char"/>
     <w:basedOn w:val="BodyTextChar"/>
     <w:rPr>
@@ -1454,25 +1361,25 @@
       <w:sz w:val="22"/>
     </w:rPr>
   </w:style>
-  <w:style w:type="character" w:customStyle="1" w:styleId="SectionNumber">
+  <w:style w:customStyle="1" w:styleId="SectionNumber" w:type="character">
     <w:name w:val="Section Number"/>
     <w:basedOn w:val="BodyTextChar"/>
   </w:style>
-  <w:style w:type="character" w:styleId="FootnoteReference">
+  <w:style w:styleId="FootnoteReference" w:type="character">
     <w:name w:val="Footnote Reference"/>
     <w:basedOn w:val="BodyTextChar"/>
     <w:rPr>
       <w:vertAlign w:val="superscript"/>
     </w:rPr>
   </w:style>
-  <w:style w:type="character" w:styleId="Hyperlink">
+  <w:style w:styleId="Hyperlink" w:type="character">
     <w:name w:val="Hyperlink"/>
     <w:basedOn w:val="BodyTextChar"/>
     <w:rPr>
-      <w:color w:val="4F81BD" w:themeColor="accent1"/>
-    </w:rPr>
-  </w:style>
-  <w:style w:type="paragraph" w:styleId="TOCHeading">
+      <w:color w:themeColor="accent1" w:val="4F81BD"/>
+    </w:rPr>
+  </w:style>
+  <w:style w:styleId="TOCHeading" w:type="paragraph">
     <w:name w:val="TOC Heading"/>
     <w:basedOn w:val="Heading1"/>
     <w:next w:val="BodyText"/>
@@ -1484,10 +1391,10 @@
       <w:outlineLvl w:val="9"/>
     </w:pPr>
     <w:rPr>
-      <w:rFonts w:asciiTheme="majorHAnsi" w:eastAsiaTheme="majorEastAsia" w:hAnsiTheme="majorHAnsi" w:cstheme="majorBidi"/>
+      <w:rFonts w:asciiTheme="majorHAnsi" w:cstheme="majorBidi" w:eastAsiaTheme="majorEastAsia" w:hAnsiTheme="majorHAnsi"/>
       <w:b w:val="0"/>
       <w:bCs w:val="0"/>
-      <w:color w:val="365F91" w:themeColor="accent1" w:themeShade="BF"/>
+      <w:color w:themeColor="accent1" w:themeShade="BF" w:val="365F91"/>
     </w:rPr>
   </w:style>
   <w:style w:type="paragraph" w:customStyle="1" w:styleId="SourceCode">

</xml_diff>